<commit_message>
Update Practica 2 Lenguajes Regulares.docx
</commit_message>
<xml_diff>
--- a/Lenguajes regulares/Practica 2 Lenguajes Regulares.docx
+++ b/Lenguajes regulares/Practica 2 Lenguajes Regulares.docx
@@ -1149,6 +1149,56 @@
     </w:p>
     <w:p>
       <w:pPr>
+        <w:pStyle w:val="Respuesta"/>
+      </w:pPr>
+      <w:r>
+        <w:tab/>
+      </w:r>
+      <w:proofErr w:type="spellStart"/>
+      <w:r>
+        <w:t>a</w:t>
+      </w:r>
+      <w:r>
+        <w:rPr>
+          <w:vertAlign w:val="superscript"/>
+        </w:rPr>
+        <w:t>n</w:t>
+      </w:r>
+      <w:proofErr w:type="spellEnd"/>
+      <w:r>
+        <w:t>(</w:t>
+      </w:r>
+      <w:proofErr w:type="spellStart"/>
+      <w:r>
+        <w:t>b|</w:t>
+      </w:r>
+      <w:proofErr w:type="gramStart"/>
+      <w:r>
+        <w:t>c</w:t>
+      </w:r>
+      <w:proofErr w:type="spellEnd"/>
+      <w:r>
+        <w:t>)</w:t>
+      </w:r>
+      <w:r>
+        <w:rPr>
+          <w:vertAlign w:val="superscript"/>
+        </w:rPr>
+        <w:t>*</w:t>
+      </w:r>
+      <w:proofErr w:type="gramEnd"/>
+      <w:r>
+        <w:rPr>
+          <w:vertAlign w:val="superscript"/>
+        </w:rPr>
+        <w:t xml:space="preserve"> </w:t>
+      </w:r>
+      <w:r>
+        <w:t>/ n sea un número par</w:t>
+      </w:r>
+    </w:p>
+    <w:p>
+      <w:pPr>
         <w:pStyle w:val="Prrafodelista"/>
         <w:numPr>
           <w:ilvl w:val="1"/>
@@ -1258,6 +1308,29 @@
           <w:spacing w:val="-5"/>
         </w:rPr>
         <w:t>.</w:t>
+      </w:r>
+    </w:p>
+    <w:p>
+      <w:pPr>
+        <w:pStyle w:val="Respuesta"/>
+        <w:ind w:left="941"/>
+      </w:pPr>
+      <w:r>
+        <w:t>(</w:t>
+      </w:r>
+      <w:proofErr w:type="spellStart"/>
+      <w:r>
+        <w:t>abc</w:t>
+      </w:r>
+      <w:proofErr w:type="spellEnd"/>
+      <w:r>
+        <w:t>)</w:t>
+      </w:r>
+      <w:r>
+        <w:rPr>
+          <w:vertAlign w:val="superscript"/>
+        </w:rPr>
+        <w:t>3i</w:t>
       </w:r>
     </w:p>
     <w:p>
@@ -1335,6 +1408,39 @@
         </w:rPr>
         <w:t>w</w:t>
       </w:r>
+    </w:p>
+    <w:p>
+      <w:pPr>
+        <w:pStyle w:val="Respuesta"/>
+        <w:ind w:left="941"/>
+      </w:pPr>
+      <w:proofErr w:type="spellStart"/>
+      <w:r>
+        <w:t>abc</w:t>
+      </w:r>
+      <w:proofErr w:type="spellEnd"/>
+      <w:r>
+        <w:t>(</w:t>
+      </w:r>
+      <w:proofErr w:type="spellStart"/>
+      <w:r>
+        <w:t>a|b|</w:t>
+      </w:r>
+      <w:proofErr w:type="gramStart"/>
+      <w:r>
+        <w:t>c</w:t>
+      </w:r>
+      <w:proofErr w:type="spellEnd"/>
+      <w:r>
+        <w:t>)</w:t>
+      </w:r>
+      <w:r>
+        <w:rPr>
+          <w:vertAlign w:val="superscript"/>
+        </w:rPr>
+        <w:t>*</w:t>
+      </w:r>
+      <w:proofErr w:type="gramEnd"/>
     </w:p>
     <w:p>
       <w:pPr>
@@ -4168,6 +4274,7 @@
         <w:ind w:left="612" w:hanging="334"/>
       </w:pPr>
       <w:r>
+        <w:lastRenderedPageBreak/>
         <w:t>Construir</w:t>
       </w:r>
       <w:r>
@@ -16199,7 +16306,7 @@
       <mc:AlternateContent>
         <mc:Choice Requires="wps">
           <w:drawing>
-            <wp:anchor distT="0" distB="0" distL="0" distR="0" simplePos="0" relativeHeight="251662336" behindDoc="1" locked="0" layoutInCell="1" allowOverlap="1" wp14:anchorId="689A9E26" wp14:editId="0EB1F7B7">
+            <wp:anchor distT="0" distB="0" distL="0" distR="0" simplePos="0" relativeHeight="251661312" behindDoc="1" locked="0" layoutInCell="1" allowOverlap="1" wp14:anchorId="689A9E26" wp14:editId="0EB1F7B7">
               <wp:simplePos x="0" y="0"/>
               <wp:positionH relativeFrom="page">
                 <wp:posOffset>1074419</wp:posOffset>
@@ -16270,7 +16377,7 @@
         </mc:Choice>
         <mc:Fallback>
           <w:pict>
-            <v:shape w14:anchorId="2EA87A57" id="Graphic 6" o:spid="_x0000_s1026" style="position:absolute;margin-left:84.6pt;margin-top:749.15pt;width:458.9pt;height:.4pt;z-index:-251654144;visibility:visible;mso-wrap-style:square;mso-wrap-distance-left:0;mso-wrap-distance-top:0;mso-wrap-distance-right:0;mso-wrap-distance-bottom:0;mso-position-horizontal:absolute;mso-position-horizontal-relative:page;mso-position-vertical:absolute;mso-position-vertical-relative:page;v-text-anchor:top" coordsize="5828030,5080" o:gfxdata="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" path="m5827775,l,,,4571r5827775,l5827775,xe" fillcolor="black" stroked="f">
+            <v:shape w14:anchorId="7CBC0510" id="Graphic 6" o:spid="_x0000_s1026" style="position:absolute;margin-left:84.6pt;margin-top:749.15pt;width:458.9pt;height:.4pt;z-index:-251655168;visibility:visible;mso-wrap-style:square;mso-wrap-distance-left:0;mso-wrap-distance-top:0;mso-wrap-distance-right:0;mso-wrap-distance-bottom:0;mso-position-horizontal:absolute;mso-position-horizontal-relative:page;mso-position-vertical:absolute;mso-position-vertical-relative:page;v-text-anchor:top" coordsize="5828030,5080" o:gfxdata="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" path="m5827775,l,,,4571r5827775,l5827775,xe" fillcolor="black" stroked="f">
               <v:path arrowok="t"/>
               <w10:wrap anchorx="page" anchory="page"/>
             </v:shape>
@@ -16286,7 +16393,7 @@
       <mc:AlternateContent>
         <mc:Choice Requires="wps">
           <w:drawing>
-            <wp:anchor distT="0" distB="0" distL="0" distR="0" simplePos="0" relativeHeight="251667456" behindDoc="1" locked="0" layoutInCell="1" allowOverlap="1" wp14:anchorId="5C78EE23" wp14:editId="26549992">
+            <wp:anchor distT="0" distB="0" distL="0" distR="0" simplePos="0" relativeHeight="251666432" behindDoc="1" locked="0" layoutInCell="1" allowOverlap="1" wp14:anchorId="5C78EE23" wp14:editId="26549992">
               <wp:simplePos x="0" y="0"/>
               <wp:positionH relativeFrom="page">
                 <wp:posOffset>1078483</wp:posOffset>
@@ -16365,7 +16472,7 @@
               <v:stroke joinstyle="miter"/>
               <v:path gradientshapeok="t" o:connecttype="rect"/>
             </v:shapetype>
-            <v:shape id="Textbox 7" o:spid="_x0000_s1039" type="#_x0000_t202" style="position:absolute;margin-left:84.9pt;margin-top:751.35pt;width:39.3pt;height:11.4pt;z-index:-251649024;visibility:visible;mso-wrap-style:square;mso-wrap-distance-left:0;mso-wrap-distance-top:0;mso-wrap-distance-right:0;mso-wrap-distance-bottom:0;mso-position-horizontal:absolute;mso-position-horizontal-relative:page;mso-position-vertical:absolute;mso-position-vertical-relative:page;v-text-anchor:top" o:gfxdata="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" filled="f" stroked="f">
+            <v:shape id="Textbox 7" o:spid="_x0000_s1039" type="#_x0000_t202" style="position:absolute;margin-left:84.9pt;margin-top:751.35pt;width:39.3pt;height:11.4pt;z-index:-251650048;visibility:visible;mso-wrap-style:square;mso-wrap-distance-left:0;mso-wrap-distance-top:0;mso-wrap-distance-right:0;mso-wrap-distance-bottom:0;mso-position-horizontal:absolute;mso-position-horizontal-relative:page;mso-position-vertical:absolute;mso-position-vertical-relative:page;v-text-anchor:top" o:gfxdata="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" filled="f" stroked="f">
               <v:textbox inset="0,0,0,0">
                 <w:txbxContent>
                   <w:p>
@@ -16414,7 +16521,7 @@
       <mc:AlternateContent>
         <mc:Choice Requires="wps">
           <w:drawing>
-            <wp:anchor distT="0" distB="0" distL="0" distR="0" simplePos="0" relativeHeight="251672576" behindDoc="1" locked="0" layoutInCell="1" allowOverlap="1" wp14:anchorId="16943C40" wp14:editId="4FD81E4B">
+            <wp:anchor distT="0" distB="0" distL="0" distR="0" simplePos="0" relativeHeight="251671552" behindDoc="1" locked="0" layoutInCell="1" allowOverlap="1" wp14:anchorId="16943C40" wp14:editId="4FD81E4B">
               <wp:simplePos x="0" y="0"/>
               <wp:positionH relativeFrom="page">
                 <wp:posOffset>6011665</wp:posOffset>
@@ -16582,7 +16689,7 @@
         </mc:Choice>
         <mc:Fallback>
           <w:pict>
-            <v:shape w14:anchorId="16943C40" id="Textbox 8" o:spid="_x0000_s1040" type="#_x0000_t202" style="position:absolute;margin-left:473.35pt;margin-top:751.35pt;width:47.9pt;height:11.4pt;z-index:-251643904;visibility:visible;mso-wrap-style:square;mso-wrap-distance-left:0;mso-wrap-distance-top:0;mso-wrap-distance-right:0;mso-wrap-distance-bottom:0;mso-position-horizontal:absolute;mso-position-horizontal-relative:page;mso-position-vertical:absolute;mso-position-vertical-relative:page;v-text-anchor:top" o:gfxdata="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" filled="f" stroked="f">
+            <v:shape w14:anchorId="16943C40" id="Textbox 8" o:spid="_x0000_s1040" type="#_x0000_t202" style="position:absolute;margin-left:473.35pt;margin-top:751.35pt;width:47.9pt;height:11.4pt;z-index:-251644928;visibility:visible;mso-wrap-style:square;mso-wrap-distance-left:0;mso-wrap-distance-top:0;mso-wrap-distance-right:0;mso-wrap-distance-bottom:0;mso-position-horizontal:absolute;mso-position-horizontal-relative:page;mso-position-vertical:absolute;mso-position-vertical-relative:page;v-text-anchor:top" o:gfxdata="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" filled="f" stroked="f">
               <v:textbox inset="0,0,0,0">
                 <w:txbxContent>
                   <w:p>
@@ -16758,7 +16865,7 @@
       <mc:AlternateContent>
         <mc:Choice Requires="wpg">
           <w:drawing>
-            <wp:anchor distT="0" distB="0" distL="0" distR="0" simplePos="0" relativeHeight="251646976" behindDoc="1" locked="0" layoutInCell="1" allowOverlap="1" wp14:anchorId="4C86628F" wp14:editId="5A7FF591">
+            <wp:anchor distT="0" distB="0" distL="0" distR="0" simplePos="0" relativeHeight="251645952" behindDoc="1" locked="0" layoutInCell="1" allowOverlap="1" wp14:anchorId="4C86628F" wp14:editId="5A7FF591">
               <wp:simplePos x="0" y="0"/>
               <wp:positionH relativeFrom="page">
                 <wp:posOffset>1074419</wp:posOffset>
@@ -16862,7 +16969,7 @@
         </mc:Choice>
         <mc:Fallback>
           <w:pict>
-            <v:group w14:anchorId="0E50D71E" id="Group 1" o:spid="_x0000_s1026" style="position:absolute;margin-left:84.6pt;margin-top:8.15pt;width:458.9pt;height:45.75pt;z-index:-251669504;mso-wrap-distance-left:0;mso-wrap-distance-right:0;mso-position-horizontal-relative:page;mso-position-vertical-relative:page" coordsize="58280,5810" o:gfxdata="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">
+            <v:group w14:anchorId="4ED4DFD8" id="Group 1" o:spid="_x0000_s1026" style="position:absolute;margin-left:84.6pt;margin-top:8.15pt;width:458.9pt;height:45.75pt;z-index:-251670528;mso-wrap-distance-left:0;mso-wrap-distance-right:0;mso-position-horizontal-relative:page;mso-position-vertical-relative:page" coordsize="58280,5810" o:gfxdata="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">
               <v:shape id="Graphic 2" o:spid="_x0000_s1027" style="position:absolute;top:4450;width:58280;height:63;visibility:visible;mso-wrap-style:square;v-text-anchor:top" coordsize="5828030,6350" o:gfxdata="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" path="m5827775,l,,,6095r5827775,l5827775,xe" fillcolor="black" stroked="f">
                 <v:path arrowok="t"/>
               </v:shape>
@@ -16902,7 +17009,7 @@
       <mc:AlternateContent>
         <mc:Choice Requires="wps">
           <w:drawing>
-            <wp:anchor distT="0" distB="0" distL="0" distR="0" simplePos="0" relativeHeight="251652096" behindDoc="1" locked="0" layoutInCell="1" allowOverlap="1" wp14:anchorId="79FCB1E9" wp14:editId="6E42299C">
+            <wp:anchor distT="0" distB="0" distL="0" distR="0" simplePos="0" relativeHeight="251651072" behindDoc="1" locked="0" layoutInCell="1" allowOverlap="1" wp14:anchorId="79FCB1E9" wp14:editId="6E42299C">
               <wp:simplePos x="0" y="0"/>
               <wp:positionH relativeFrom="page">
                 <wp:posOffset>1925818</wp:posOffset>
@@ -17025,7 +17132,7 @@
               <v:stroke joinstyle="miter"/>
               <v:path gradientshapeok="t" o:connecttype="rect"/>
             </v:shapetype>
-            <v:shape id="Textbox 4" o:spid="_x0000_s1037" type="#_x0000_t202" style="position:absolute;margin-left:151.65pt;margin-top:17.6pt;width:86.4pt;height:25.95pt;z-index:-251664384;visibility:visible;mso-wrap-style:square;mso-wrap-distance-left:0;mso-wrap-distance-top:0;mso-wrap-distance-right:0;mso-wrap-distance-bottom:0;mso-position-horizontal:absolute;mso-position-horizontal-relative:page;mso-position-vertical:absolute;mso-position-vertical-relative:page;v-text-anchor:top" o:gfxdata="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" filled="f" stroked="f">
+            <v:shape id="Textbox 4" o:spid="_x0000_s1037" type="#_x0000_t202" style="position:absolute;margin-left:151.65pt;margin-top:17.6pt;width:86.4pt;height:25.95pt;z-index:-251665408;visibility:visible;mso-wrap-style:square;mso-wrap-distance-left:0;mso-wrap-distance-top:0;mso-wrap-distance-right:0;mso-wrap-distance-bottom:0;mso-position-horizontal:absolute;mso-position-horizontal-relative:page;mso-position-vertical:absolute;mso-position-vertical-relative:page;v-text-anchor:top" o:gfxdata="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" filled="f" stroked="f">
               <v:textbox inset="0,0,0,0">
                 <w:txbxContent>
                   <w:p>
@@ -17118,7 +17225,7 @@
       <mc:AlternateContent>
         <mc:Choice Requires="wps">
           <w:drawing>
-            <wp:anchor distT="0" distB="0" distL="0" distR="0" simplePos="0" relativeHeight="251656192" behindDoc="1" locked="0" layoutInCell="1" allowOverlap="1" wp14:anchorId="7B432A26" wp14:editId="5AB4E3F9">
+            <wp:anchor distT="0" distB="0" distL="0" distR="0" simplePos="0" relativeHeight="251657216" behindDoc="1" locked="0" layoutInCell="1" allowOverlap="1" wp14:anchorId="7B432A26" wp14:editId="5AB4E3F9">
               <wp:simplePos x="0" y="0"/>
               <wp:positionH relativeFrom="page">
                 <wp:posOffset>3699592</wp:posOffset>
@@ -17351,7 +17458,7 @@
         </mc:Choice>
         <mc:Fallback>
           <w:pict>
-            <v:shape w14:anchorId="7B432A26" id="Textbox 5" o:spid="_x0000_s1038" type="#_x0000_t202" style="position:absolute;margin-left:291.3pt;margin-top:17.6pt;width:242.05pt;height:25.95pt;z-index:-251660288;visibility:visible;mso-wrap-style:square;mso-wrap-distance-left:0;mso-wrap-distance-top:0;mso-wrap-distance-right:0;mso-wrap-distance-bottom:0;mso-position-horizontal:absolute;mso-position-horizontal-relative:page;mso-position-vertical:absolute;mso-position-vertical-relative:page;v-text-anchor:top" o:gfxdata="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" filled="f" stroked="f">
+            <v:shape w14:anchorId="7B432A26" id="Textbox 5" o:spid="_x0000_s1038" type="#_x0000_t202" style="position:absolute;margin-left:291.3pt;margin-top:17.6pt;width:242.05pt;height:25.95pt;z-index:-251659264;visibility:visible;mso-wrap-style:square;mso-wrap-distance-left:0;mso-wrap-distance-top:0;mso-wrap-distance-right:0;mso-wrap-distance-bottom:0;mso-position-horizontal:absolute;mso-position-horizontal-relative:page;mso-position-vertical:absolute;mso-position-vertical-relative:page;v-text-anchor:top" o:gfxdata="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" filled="f" stroked="f">
               <v:textbox inset="0,0,0,0">
                 <w:txbxContent>
                   <w:p>

</xml_diff>